<commit_message>
docs(firmware): clarify exact UART rate and propose PC CLI
</commit_message>
<xml_diff>
--- a/docs/firmware/MVP-PPG_펌웨어_개발계획_초안_v0.3_20261025.docx
+++ b/docs/firmware/MVP-PPG_펌웨어_개발계획_초안_v0.3_20261025.docx
@@ -4264,10 +4264,7 @@
         <w:snapToGrid w:val="0"/>
       </w:pPr>
       <w:r>
-        <w:rPr>
-          <w:b w:val="0"/>
-        </w:rPr>
-        <w:t>PC용 USB-UART 어댑터의 250000 baud 지원을 확인한다. 48 MHz 클럭의 명목 분주비는 192로 정수이지만, 실제 발진기 오차와 온도 드리프트는 별도로 검증한다. 특정 수신 설정을 확인하지 않은 일괄적인 UART 허용 오차는 가정하지 않는다. 폴링 시각은 상대 시각으로 기록하고 PC와의 장기 드리프트를 구분한다.</w:t>
+        <w:t>USART1 입력 클럭은 명목 48 MHz, 프리스케일러 1, 오버샘플링 16배(OVER8=0)로 둔다. BRR=192(0x00C0)이면 48,000,000 ÷ 1 ÷ 192 = 250,000 bps로 분주 오차는 0%다. 발진기의 실제 오차·온도 드리프트와 USB-UART의 250000 baud 지원은 별도 검증한다. 폴링 시각은 상대 시각이며 PC와의 장기 드리프트를 구분한다. [4]</w:t>
       </w:r>
     </w:p>
     <w:p>
@@ -8422,7 +8419,7 @@
         <w:spacing w:after="100" w:line="259" w:lineRule="auto"/>
       </w:pPr>
       <w:r>
-        <w:t>제어 응답은 DATA 사이에 삽입하며 DMA를 끊지 않는다. PC 요청은 재시도 포함 초당 최대 5개, 자동 상태 조회는 1회 이하로 둔다. 최대 응답 62 B × 5 × 10 = 3100 bps를 더하면 약 172105 bps로 250 kbps의 68.9%다. 복구 이벤트·지연 후 배출 부하는 별도 시험한다.</w:t>
+        <w:t>제어 응답은 DATA 사이에 넣고 DMA를 끊지 않는다. PC 요청은 재시도 포함 최대 5회/s, 자동 상태 조회는 1회/s 이하다. 200 DATA/s의 169004.8 + (62 × 5 × 10) = 172104.8 bps다. 사용률은 172104.8 ÷ 250000 × 100 = 68.84192% ≈ 68.84%다. 복구 이벤트가 없는 정상 상태 계산이며 지연 후 배출은 별도 시험한다.</w:t>
       </w:r>
     </w:p>
     <w:p>
@@ -8714,6 +8711,683 @@
       <w:pPr>
         <w:spacing w:after="0" w:line="259" w:lineRule="auto"/>
       </w:pPr>
+    </w:p>
+    <w:p>
+      <w:pPr>
+        <w:pStyle w:val="Heading1"/>
+        <w:pageBreakBefore/>
+      </w:pPr>
+      <w:r>
+        <w:t>PC 프로그램에서 사용할 명령</w:t>
+      </w:r>
+    </w:p>
+    <w:p>
+      <w:pPr>
+        <w:spacing w:after="100" w:line="259" w:lineRule="auto"/>
+      </w:pPr>
+      <w:r>
+        <w:t>PC용 ppg 명령의 구현 전 제안이다. 프로그램은 명령을 앞 절의 바이너리 요청으로 변환한다. COM5는 예시 포트이며 settings.json의 LED 전류·ADC 코드는 실물 검증 후 입력한다.</w:t>
+      </w:r>
+    </w:p>
+    <w:tbl>
+      <w:tblPr>
+        <w:tblStyle w:val="TableGrid"/>
+        <w:tblW w:type="auto" w:w="0"/>
+        <w:tblLayout w:type="fixed"/>
+        <w:tblLook w:firstColumn="1" w:firstRow="1" w:lastColumn="0" w:lastRow="0" w:noHBand="0" w:noVBand="1" w:val="04A0"/>
+      </w:tblPr>
+      <w:tblGrid>
+        <w:gridCol w:w="4536"/>
+        <w:gridCol w:w="2304"/>
+        <w:gridCol w:w="3125"/>
+      </w:tblGrid>
+      <w:tr>
+        <w:trPr>
+          <w:cantSplit/>
+          <w:tblHeader/>
+        </w:trPr>
+        <w:tc>
+          <w:tcPr>
+            <w:tcW w:type="dxa" w:w="4536"/>
+            <w:shd w:fill="E8EDF3"/>
+          </w:tcPr>
+          <w:p>
+            <w:pPr>
+              <w:spacing w:before="40" w:after="60" w:line="247" w:lineRule="auto"/>
+            </w:pPr>
+            <w:r>
+              <w:rPr>
+                <w:rFonts w:ascii="Malgun Gothic" w:hAnsi="Malgun Gothic" w:eastAsia="맑은 고딕"/>
+                <w:b/>
+                <w:sz w:val="20"/>
+              </w:rPr>
+              <w:t>PC 명령 예시</w:t>
+            </w:r>
+          </w:p>
+        </w:tc>
+        <w:tc>
+          <w:tcPr>
+            <w:tcW w:type="dxa" w:w="2304"/>
+            <w:shd w:fill="E8EDF3"/>
+          </w:tcPr>
+          <w:p>
+            <w:pPr>
+              <w:spacing w:before="40" w:after="60" w:line="247" w:lineRule="auto"/>
+            </w:pPr>
+            <w:r>
+              <w:rPr>
+                <w:rFonts w:ascii="Malgun Gothic" w:hAnsi="Malgun Gothic" w:eastAsia="맑은 고딕"/>
+                <w:b/>
+                <w:sz w:val="20"/>
+              </w:rPr>
+              <w:t>대응 장치 명령</w:t>
+            </w:r>
+          </w:p>
+        </w:tc>
+        <w:tc>
+          <w:tcPr>
+            <w:tcW w:type="dxa" w:w="3125"/>
+            <w:shd w:fill="E8EDF3"/>
+          </w:tcPr>
+          <w:p>
+            <w:pPr>
+              <w:spacing w:before="40" w:after="60" w:line="247" w:lineRule="auto"/>
+            </w:pPr>
+            <w:r>
+              <w:rPr>
+                <w:rFonts w:ascii="Malgun Gothic" w:hAnsi="Malgun Gothic" w:eastAsia="맑은 고딕"/>
+                <w:b/>
+                <w:sz w:val="20"/>
+              </w:rPr>
+              <w:t>동작</w:t>
+            </w:r>
+          </w:p>
+        </w:tc>
+      </w:tr>
+      <w:tr>
+        <w:trPr>
+          <w:cantSplit/>
+        </w:trPr>
+        <w:tc>
+          <w:tcPr>
+            <w:tcW w:type="dxa" w:w="4536"/>
+          </w:tcPr>
+          <w:p>
+            <w:pPr>
+              <w:spacing w:before="40" w:after="60" w:line="247" w:lineRule="auto"/>
+            </w:pPr>
+            <w:r>
+              <w:rPr>
+                <w:rFonts w:ascii="Malgun Gothic" w:hAnsi="Malgun Gothic" w:eastAsia="맑은 고딕"/>
+                <w:b w:val="0"/>
+                <w:sz w:val="20"/>
+              </w:rPr>
+              <w:t>ppg ports</w:t>
+            </w:r>
+          </w:p>
+        </w:tc>
+        <w:tc>
+          <w:tcPr>
+            <w:tcW w:type="dxa" w:w="2304"/>
+          </w:tcPr>
+          <w:p>
+            <w:pPr>
+              <w:spacing w:before="40" w:after="60" w:line="247" w:lineRule="auto"/>
+            </w:pPr>
+            <w:r>
+              <w:rPr>
+                <w:rFonts w:ascii="Malgun Gothic" w:hAnsi="Malgun Gothic" w:eastAsia="맑은 고딕"/>
+                <w:b w:val="0"/>
+                <w:sz w:val="20"/>
+              </w:rPr>
+              <w:t>없음</w:t>
+            </w:r>
+          </w:p>
+        </w:tc>
+        <w:tc>
+          <w:tcPr>
+            <w:tcW w:type="dxa" w:w="3125"/>
+          </w:tcPr>
+          <w:p>
+            <w:pPr>
+              <w:spacing w:before="40" w:after="60" w:line="247" w:lineRule="auto"/>
+            </w:pPr>
+            <w:r>
+              <w:rPr>
+                <w:rFonts w:ascii="Malgun Gothic" w:hAnsi="Malgun Gothic" w:eastAsia="맑은 고딕"/>
+                <w:b w:val="0"/>
+                <w:sz w:val="20"/>
+              </w:rPr>
+              <w:t>연결 가능한 직렬 포트 목록.</w:t>
+            </w:r>
+          </w:p>
+        </w:tc>
+      </w:tr>
+      <w:tr>
+        <w:trPr>
+          <w:cantSplit/>
+        </w:trPr>
+        <w:tc>
+          <w:tcPr>
+            <w:tcW w:type="dxa" w:w="4536"/>
+          </w:tcPr>
+          <w:p>
+            <w:pPr>
+              <w:spacing w:before="40" w:after="60" w:line="247" w:lineRule="auto"/>
+            </w:pPr>
+            <w:r>
+              <w:rPr>
+                <w:rFonts w:ascii="Malgun Gothic" w:hAnsi="Malgun Gothic" w:eastAsia="맑은 고딕"/>
+                <w:b w:val="0"/>
+                <w:sz w:val="20"/>
+              </w:rPr>
+              <w:t>ppg info --port COM5</w:t>
+            </w:r>
+          </w:p>
+        </w:tc>
+        <w:tc>
+          <w:tcPr>
+            <w:tcW w:type="dxa" w:w="2304"/>
+          </w:tcPr>
+          <w:p>
+            <w:pPr>
+              <w:spacing w:before="40" w:after="60" w:line="247" w:lineRule="auto"/>
+            </w:pPr>
+            <w:r>
+              <w:rPr>
+                <w:rFonts w:ascii="Malgun Gothic" w:hAnsi="Malgun Gothic" w:eastAsia="맑은 고딕"/>
+                <w:b w:val="0"/>
+                <w:sz w:val="20"/>
+              </w:rPr>
+              <w:t>PING GET_INFO</w:t>
+            </w:r>
+          </w:p>
+        </w:tc>
+        <w:tc>
+          <w:tcPr>
+            <w:tcW w:type="dxa" w:w="3125"/>
+          </w:tcPr>
+          <w:p>
+            <w:pPr>
+              <w:spacing w:before="40" w:after="60" w:line="247" w:lineRule="auto"/>
+            </w:pPr>
+            <w:r>
+              <w:rPr>
+                <w:rFonts w:ascii="Malgun Gothic" w:hAnsi="Malgun Gothic" w:eastAsia="맑은 고딕"/>
+                <w:b w:val="0"/>
+                <w:sz w:val="20"/>
+              </w:rPr>
+              <w:t>연결·규격·빌드 확인.</w:t>
+            </w:r>
+          </w:p>
+        </w:tc>
+      </w:tr>
+      <w:tr>
+        <w:trPr>
+          <w:cantSplit/>
+        </w:trPr>
+        <w:tc>
+          <w:tcPr>
+            <w:tcW w:type="dxa" w:w="4536"/>
+          </w:tcPr>
+          <w:p>
+            <w:pPr>
+              <w:spacing w:before="40" w:after="60" w:line="247" w:lineRule="auto"/>
+            </w:pPr>
+            <w:r>
+              <w:rPr>
+                <w:rFonts w:ascii="Malgun Gothic" w:hAnsi="Malgun Gothic" w:eastAsia="맑은 고딕"/>
+                <w:b w:val="0"/>
+                <w:sz w:val="20"/>
+              </w:rPr>
+              <w:t>ppg status --port COM5</w:t>
+            </w:r>
+          </w:p>
+        </w:tc>
+        <w:tc>
+          <w:tcPr>
+            <w:tcW w:type="dxa" w:w="2304"/>
+          </w:tcPr>
+          <w:p>
+            <w:pPr>
+              <w:spacing w:before="40" w:after="60" w:line="247" w:lineRule="auto"/>
+            </w:pPr>
+            <w:r>
+              <w:rPr>
+                <w:rFonts w:ascii="Malgun Gothic" w:hAnsi="Malgun Gothic" w:eastAsia="맑은 고딕"/>
+                <w:b w:val="0"/>
+                <w:sz w:val="20"/>
+              </w:rPr>
+              <w:t>GET_STATUS</w:t>
+            </w:r>
+          </w:p>
+        </w:tc>
+        <w:tc>
+          <w:tcPr>
+            <w:tcW w:type="dxa" w:w="3125"/>
+          </w:tcPr>
+          <w:p>
+            <w:pPr>
+              <w:spacing w:before="40" w:after="60" w:line="247" w:lineRule="auto"/>
+            </w:pPr>
+            <w:r>
+              <w:rPr>
+                <w:rFonts w:ascii="Malgun Gothic" w:hAnsi="Malgun Gothic" w:eastAsia="맑은 고딕"/>
+                <w:b w:val="0"/>
+                <w:sz w:val="20"/>
+              </w:rPr>
+              <w:t>상태·세션·epoch·오류 조회.</w:t>
+            </w:r>
+          </w:p>
+        </w:tc>
+      </w:tr>
+      <w:tr>
+        <w:trPr>
+          <w:cantSplit/>
+        </w:trPr>
+        <w:tc>
+          <w:tcPr>
+            <w:tcW w:type="dxa" w:w="4536"/>
+          </w:tcPr>
+          <w:p>
+            <w:pPr>
+              <w:spacing w:before="40" w:after="60" w:line="247" w:lineRule="auto"/>
+            </w:pPr>
+            <w:r>
+              <w:rPr>
+                <w:rFonts w:ascii="Malgun Gothic" w:hAnsi="Malgun Gothic" w:eastAsia="맑은 고딕"/>
+                <w:b w:val="0"/>
+                <w:sz w:val="20"/>
+              </w:rPr>
+              <w:t>ppg config show --port COM5</w:t>
+            </w:r>
+          </w:p>
+        </w:tc>
+        <w:tc>
+          <w:tcPr>
+            <w:tcW w:type="dxa" w:w="2304"/>
+          </w:tcPr>
+          <w:p>
+            <w:pPr>
+              <w:spacing w:before="40" w:after="60" w:line="247" w:lineRule="auto"/>
+            </w:pPr>
+            <w:r>
+              <w:rPr>
+                <w:rFonts w:ascii="Malgun Gothic" w:hAnsi="Malgun Gothic" w:eastAsia="맑은 고딕"/>
+                <w:b w:val="0"/>
+                <w:sz w:val="20"/>
+              </w:rPr>
+              <w:t>GET_CONFIG</w:t>
+            </w:r>
+          </w:p>
+        </w:tc>
+        <w:tc>
+          <w:tcPr>
+            <w:tcW w:type="dxa" w:w="3125"/>
+          </w:tcPr>
+          <w:p>
+            <w:pPr>
+              <w:spacing w:before="40" w:after="60" w:line="247" w:lineRule="auto"/>
+            </w:pPr>
+            <w:r>
+              <w:rPr>
+                <w:rFonts w:ascii="Malgun Gothic" w:hAnsi="Malgun Gothic" w:eastAsia="맑은 고딕"/>
+                <w:b w:val="0"/>
+                <w:sz w:val="20"/>
+              </w:rPr>
+              <w:t>실제 적용 설정과 ID 표시.</w:t>
+            </w:r>
+          </w:p>
+        </w:tc>
+      </w:tr>
+      <w:tr>
+        <w:trPr>
+          <w:cantSplit/>
+        </w:trPr>
+        <w:tc>
+          <w:tcPr>
+            <w:tcW w:type="dxa" w:w="4536"/>
+          </w:tcPr>
+          <w:p>
+            <w:pPr>
+              <w:spacing w:before="40" w:after="60" w:line="247" w:lineRule="auto"/>
+            </w:pPr>
+            <w:r>
+              <w:rPr>
+                <w:rFonts w:ascii="Malgun Gothic" w:hAnsi="Malgun Gothic" w:eastAsia="맑은 고딕"/>
+                <w:b w:val="0"/>
+                <w:sz w:val="20"/>
+              </w:rPr>
+              <w:t>ppg config apply --port COM5 --file settings.json</w:t>
+            </w:r>
+          </w:p>
+        </w:tc>
+        <w:tc>
+          <w:tcPr>
+            <w:tcW w:type="dxa" w:w="2304"/>
+          </w:tcPr>
+          <w:p>
+            <w:pPr>
+              <w:spacing w:before="40" w:after="60" w:line="247" w:lineRule="auto"/>
+            </w:pPr>
+            <w:r>
+              <w:rPr>
+                <w:rFonts w:ascii="Malgun Gothic" w:hAnsi="Malgun Gothic" w:eastAsia="맑은 고딕"/>
+                <w:b w:val="0"/>
+                <w:sz w:val="20"/>
+              </w:rPr>
+              <w:t>SET_CONFIG GET_CONFIG</w:t>
+            </w:r>
+          </w:p>
+        </w:tc>
+        <w:tc>
+          <w:tcPr>
+            <w:tcW w:type="dxa" w:w="3125"/>
+          </w:tcPr>
+          <w:p>
+            <w:pPr>
+              <w:spacing w:before="40" w:after="60" w:line="247" w:lineRule="auto"/>
+            </w:pPr>
+            <w:r>
+              <w:rPr>
+                <w:rFonts w:ascii="Malgun Gothic" w:hAnsi="Malgun Gothic" w:eastAsia="맑은 고딕"/>
+                <w:b w:val="0"/>
+                <w:sz w:val="20"/>
+              </w:rPr>
+              <w:t>IDLE에서 설정 검증·적용·재조회.</w:t>
+            </w:r>
+          </w:p>
+        </w:tc>
+      </w:tr>
+      <w:tr>
+        <w:trPr>
+          <w:cantSplit/>
+        </w:trPr>
+        <w:tc>
+          <w:tcPr>
+            <w:tcW w:type="dxa" w:w="4536"/>
+          </w:tcPr>
+          <w:p>
+            <w:pPr>
+              <w:spacing w:before="40" w:after="60" w:line="247" w:lineRule="auto"/>
+            </w:pPr>
+            <w:r>
+              <w:rPr>
+                <w:rFonts w:ascii="Malgun Gothic" w:hAnsi="Malgun Gothic" w:eastAsia="맑은 고딕"/>
+                <w:b w:val="0"/>
+                <w:sz w:val="20"/>
+              </w:rPr>
+              <w:t>ppg capture --port COM5 --config settings.json --duration 600 --out run01</w:t>
+            </w:r>
+          </w:p>
+        </w:tc>
+        <w:tc>
+          <w:tcPr>
+            <w:tcW w:type="dxa" w:w="2304"/>
+          </w:tcPr>
+          <w:p>
+            <w:pPr>
+              <w:spacing w:before="40" w:after="60" w:line="247" w:lineRule="auto"/>
+            </w:pPr>
+            <w:r>
+              <w:rPr>
+                <w:rFonts w:ascii="Malgun Gothic" w:hAnsi="Malgun Gothic" w:eastAsia="맑은 고딕"/>
+                <w:b w:val="0"/>
+                <w:sz w:val="20"/>
+              </w:rPr>
+              <w:t>상태 확인 SET_CONFIG START STOP</w:t>
+            </w:r>
+          </w:p>
+        </w:tc>
+        <w:tc>
+          <w:tcPr>
+            <w:tcW w:type="dxa" w:w="3125"/>
+          </w:tcPr>
+          <w:p>
+            <w:pPr>
+              <w:spacing w:before="40" w:after="60" w:line="247" w:lineRule="auto"/>
+            </w:pPr>
+            <w:r>
+              <w:rPr>
+                <w:rFonts w:ascii="Malgun Gothic" w:hAnsi="Malgun Gothic" w:eastAsia="맑은 고딕"/>
+                <w:b w:val="0"/>
+                <w:sz w:val="20"/>
+              </w:rPr>
+              <w:t>600초 수집과 파일 저장, 정지 확인.</w:t>
+            </w:r>
+          </w:p>
+        </w:tc>
+      </w:tr>
+      <w:tr>
+        <w:trPr>
+          <w:cantSplit/>
+        </w:trPr>
+        <w:tc>
+          <w:tcPr>
+            <w:tcW w:type="dxa" w:w="4536"/>
+          </w:tcPr>
+          <w:p>
+            <w:pPr>
+              <w:spacing w:before="40" w:after="60" w:line="247" w:lineRule="auto"/>
+            </w:pPr>
+            <w:r>
+              <w:rPr>
+                <w:rFonts w:ascii="Malgun Gothic" w:hAnsi="Malgun Gothic" w:eastAsia="맑은 고딕"/>
+                <w:b w:val="0"/>
+                <w:sz w:val="20"/>
+              </w:rPr>
+              <w:t>ppg stop --port COM5</w:t>
+            </w:r>
+          </w:p>
+        </w:tc>
+        <w:tc>
+          <w:tcPr>
+            <w:tcW w:type="dxa" w:w="2304"/>
+          </w:tcPr>
+          <w:p>
+            <w:pPr>
+              <w:spacing w:before="40" w:after="60" w:line="247" w:lineRule="auto"/>
+            </w:pPr>
+            <w:r>
+              <w:rPr>
+                <w:rFonts w:ascii="Malgun Gothic" w:hAnsi="Malgun Gothic" w:eastAsia="맑은 고딕"/>
+                <w:b w:val="0"/>
+                <w:sz w:val="20"/>
+              </w:rPr>
+              <w:t>GET_STATUS STOP</w:t>
+            </w:r>
+          </w:p>
+        </w:tc>
+        <w:tc>
+          <w:tcPr>
+            <w:tcW w:type="dxa" w:w="3125"/>
+          </w:tcPr>
+          <w:p>
+            <w:pPr>
+              <w:spacing w:before="40" w:after="60" w:line="247" w:lineRule="auto"/>
+            </w:pPr>
+            <w:r>
+              <w:rPr>
+                <w:rFonts w:ascii="Malgun Gothic" w:hAnsi="Malgun Gothic" w:eastAsia="맑은 고딕"/>
+                <w:b w:val="0"/>
+                <w:sz w:val="20"/>
+              </w:rPr>
+              <w:t>포트가 해제된 뒤 남은 측정 정지.</w:t>
+            </w:r>
+          </w:p>
+        </w:tc>
+      </w:tr>
+      <w:tr>
+        <w:trPr>
+          <w:cantSplit/>
+        </w:trPr>
+        <w:tc>
+          <w:tcPr>
+            <w:tcW w:type="dxa" w:w="4536"/>
+          </w:tcPr>
+          <w:p>
+            <w:pPr>
+              <w:spacing w:before="40" w:after="60" w:line="247" w:lineRule="auto"/>
+            </w:pPr>
+            <w:r>
+              <w:rPr>
+                <w:rFonts w:ascii="Malgun Gothic" w:hAnsi="Malgun Gothic" w:eastAsia="맑은 고딕"/>
+                <w:b w:val="0"/>
+                <w:sz w:val="20"/>
+              </w:rPr>
+              <w:t>ppg stats clear --port COM5</w:t>
+            </w:r>
+          </w:p>
+        </w:tc>
+        <w:tc>
+          <w:tcPr>
+            <w:tcW w:type="dxa" w:w="2304"/>
+          </w:tcPr>
+          <w:p>
+            <w:pPr>
+              <w:spacing w:before="40" w:after="60" w:line="247" w:lineRule="auto"/>
+            </w:pPr>
+            <w:r>
+              <w:rPr>
+                <w:rFonts w:ascii="Malgun Gothic" w:hAnsi="Malgun Gothic" w:eastAsia="맑은 고딕"/>
+                <w:b w:val="0"/>
+                <w:sz w:val="20"/>
+              </w:rPr>
+              <w:t>CLEAR_STATS</w:t>
+            </w:r>
+          </w:p>
+        </w:tc>
+        <w:tc>
+          <w:tcPr>
+            <w:tcW w:type="dxa" w:w="3125"/>
+          </w:tcPr>
+          <w:p>
+            <w:pPr>
+              <w:spacing w:before="40" w:after="60" w:line="247" w:lineRule="auto"/>
+            </w:pPr>
+            <w:r>
+              <w:rPr>
+                <w:rFonts w:ascii="Malgun Gothic" w:hAnsi="Malgun Gothic" w:eastAsia="맑은 고딕"/>
+                <w:b w:val="0"/>
+                <w:sz w:val="20"/>
+              </w:rPr>
+              <w:t>IDLE에서 조회용 통계 초기화.</w:t>
+            </w:r>
+          </w:p>
+        </w:tc>
+      </w:tr>
+      <w:tr>
+        <w:trPr>
+          <w:cantSplit/>
+        </w:trPr>
+        <w:tc>
+          <w:tcPr>
+            <w:tcW w:type="dxa" w:w="4536"/>
+          </w:tcPr>
+          <w:p>
+            <w:pPr>
+              <w:spacing w:before="40" w:after="60" w:line="247" w:lineRule="auto"/>
+            </w:pPr>
+            <w:r>
+              <w:rPr>
+                <w:rFonts w:ascii="Malgun Gothic" w:hAnsi="Malgun Gothic" w:eastAsia="맑은 고딕"/>
+                <w:b w:val="0"/>
+                <w:sz w:val="20"/>
+              </w:rPr>
+              <w:t>ppg validate --in run01</w:t>
+            </w:r>
+          </w:p>
+        </w:tc>
+        <w:tc>
+          <w:tcPr>
+            <w:tcW w:type="dxa" w:w="2304"/>
+          </w:tcPr>
+          <w:p>
+            <w:pPr>
+              <w:spacing w:before="40" w:after="60" w:line="247" w:lineRule="auto"/>
+            </w:pPr>
+            <w:r>
+              <w:rPr>
+                <w:rFonts w:ascii="Malgun Gothic" w:hAnsi="Malgun Gothic" w:eastAsia="맑은 고딕"/>
+                <w:b w:val="0"/>
+                <w:sz w:val="20"/>
+              </w:rPr>
+              <w:t>없음</w:t>
+            </w:r>
+          </w:p>
+        </w:tc>
+        <w:tc>
+          <w:tcPr>
+            <w:tcW w:type="dxa" w:w="3125"/>
+          </w:tcPr>
+          <w:p>
+            <w:pPr>
+              <w:spacing w:before="40" w:after="60" w:line="247" w:lineRule="auto"/>
+            </w:pPr>
+            <w:r>
+              <w:rPr>
+                <w:rFonts w:ascii="Malgun Gothic" w:hAnsi="Malgun Gothic" w:eastAsia="맑은 고딕"/>
+                <w:b w:val="0"/>
+                <w:sz w:val="20"/>
+              </w:rPr>
+              <w:t>저장 파일의 CRC·순번·손실 검사.</w:t>
+            </w:r>
+          </w:p>
+        </w:tc>
+      </w:tr>
+    </w:tbl>
+    <w:p>
+      <w:pPr>
+        <w:spacing w:after="0" w:line="259" w:lineRule="auto"/>
+      </w:pPr>
+    </w:p>
+    <w:p>
+      <w:pPr>
+        <w:pStyle w:val="Heading2"/>
+      </w:pPr>
+      <w:r>
+        <w:t>수집 프로세스의 포트와 종료 처리</w:t>
+      </w:r>
+    </w:p>
+    <w:p>
+      <w:pPr>
+        <w:spacing w:after="100" w:line="259" w:lineRule="auto"/>
+      </w:pPr>
+      <w:r>
+        <w:t>capture가 포트를 단독 소유하며 기존 STREAMING은 거절한다. 기간 만료·Ctrl+C 한 번이면 같은 연결에서 STOP을 보내고 STOPPED·통계 저장 후 포트를 닫는다. 실행 중 별도 info·status·stop으로 같은 포트를 열지 않는다.</w:t>
+      </w:r>
+    </w:p>
+    <w:p>
+      <w:pPr>
+        <w:spacing w:after="100" w:line="259" w:lineRule="auto"/>
+      </w:pPr>
+      <w:r>
+        <w:t>강제 종료·통신 단절은 정지 미확인으로 남긴다. 포트 해제 후 ppg stop으로 현재 세션을 정지한다. 설정의 허용 코드·필수값을 검증하며 미확정 전류·ADC 값의 자동 대체는 금지한다.</w:t>
+      </w:r>
+    </w:p>
+    <w:p>
+      <w:pPr>
+        <w:pStyle w:val="Heading2"/>
+      </w:pPr>
+      <w:r>
+        <w:t>저장 파일과 결과 코드</w:t>
+      </w:r>
+    </w:p>
+    <w:p>
+      <w:pPr>
+        <w:spacing w:after="100" w:line="259" w:lineRule="auto"/>
+      </w:pPr>
+      <w:r>
+        <w:t>run01/rx.bin은 응답·이벤트·손상 프레임 포함 UART 수신 원본이다. session.json은 설정·장치·시각·세션 응답을, summary.json은 오류·손실·미확정 구간을 담는다. stop_confirmed는 시작 시 false, STOPPED 확인 후 true로 저장한다. 기존 파일 덮어쓰기는 금지한다.</w:t>
+      </w:r>
+    </w:p>
+    <w:p>
+      <w:pPr>
+        <w:spacing w:after="100" w:line="259" w:lineRule="auto"/>
+      </w:pPr>
+      <w:r>
+        <w:t>종료 코드: 0 정상, 2 입력·프로토콜 오류, 3 손실·CRC 오류, 4 통신 시간 초과·정지 미확인. validate는 포트를 열지 않는 검사이며 원본과 손실 기록을 유지한다. PC 구현 전 확정할 제안값이다.</w:t>
+      </w:r>
     </w:p>
     <w:sectPr>
       <w:footerReference w:type="default" r:id="rId9"/>

</xml_diff>